<commit_message>
DAP QB Week 4 & 6 Ans FIx
</commit_message>
<xml_diff>
--- a/DAP - Data Analysis using Python/DAP_QB_ANS/DAP_QB_Week_4_Ans.docx
+++ b/DAP - Data Analysis using Python/DAP_QB_ANS/DAP_QB_Week_4_Ans.docx
@@ -302,67 +302,35 @@
                 <w:sz w:val="28"/>
                 <w:szCs w:val="28"/>
               </w:rPr>
-              <w:t>Hypothesis Testing is a statistical method used to determine whether a statement about the value of a population parameter should or should not be rejected based on sample data. It involves formulating two competing statements, the null hypothesis (H0) and the alternative hypothesis (Ha</w:t>
-            </w:r>
-            <w:r>
-              <w:rPr>
-                <w:rFonts w:asciiTheme="minorHAnsi" w:hAnsiTheme="minorHAnsi" w:cstheme="minorHAnsi"/>
-                <w:sz w:val="28"/>
-                <w:szCs w:val="28"/>
-              </w:rPr>
-              <w:t>) and</w:t>
-            </w:r>
-            <w:r>
-              <w:rPr>
-                <w:rFonts w:asciiTheme="minorHAnsi" w:hAnsiTheme="minorHAnsi" w:cstheme="minorHAnsi"/>
-                <w:sz w:val="28"/>
-                <w:szCs w:val="28"/>
-              </w:rPr>
-              <w:t xml:space="preserve"> using data from a sample to test these hypotheses.</w:t>
-            </w:r>
-          </w:p>
-          <w:p>
-            <w:pPr>
-              <w:pStyle w:val="TableParagraph"/>
-              <w:rPr>
-                <w:rFonts w:asciiTheme="minorHAnsi" w:hAnsiTheme="minorHAnsi" w:cstheme="minorHAnsi"/>
-                <w:sz w:val="28"/>
-                <w:szCs w:val="28"/>
-              </w:rPr>
-            </w:pPr>
-          </w:p>
-          <w:p>
-            <w:pPr>
-              <w:pStyle w:val="TableParagraph"/>
-              <w:rPr>
-                <w:rFonts w:asciiTheme="minorHAnsi" w:hAnsiTheme="minorHAnsi" w:cstheme="minorHAnsi"/>
-                <w:sz w:val="28"/>
-                <w:szCs w:val="28"/>
-              </w:rPr>
-            </w:pPr>
-            <w:r>
-              <w:rPr>
-                <w:rFonts w:asciiTheme="minorHAnsi" w:hAnsiTheme="minorHAnsi" w:cstheme="minorHAnsi"/>
-                <w:sz w:val="28"/>
-                <w:szCs w:val="28"/>
-              </w:rPr>
-              <w:t xml:space="preserve">The null hypothesis, denoted by H0, is a tentative assumption about a population parameter. It is typically a statement of no effect or no </w:t>
-            </w:r>
-            <w:r>
-              <w:rPr>
-                <w:rFonts w:asciiTheme="minorHAnsi" w:hAnsiTheme="minorHAnsi" w:cstheme="minorHAnsi"/>
-                <w:sz w:val="28"/>
-                <w:szCs w:val="28"/>
-              </w:rPr>
-              <w:t>difference and</w:t>
-            </w:r>
-            <w:r>
-              <w:rPr>
-                <w:rFonts w:asciiTheme="minorHAnsi" w:hAnsiTheme="minorHAnsi" w:cstheme="minorHAnsi"/>
-                <w:sz w:val="28"/>
-                <w:szCs w:val="28"/>
-              </w:rPr>
-              <w:t xml:space="preserve"> is often the hypothesis that a researcher aims to disprove.</w:t>
+              <w:t>Hypothesis Testing is a statistical method used to determine whether a statement about the value of a population parameter should or should not be rejected based on sample data. It involves formulating two competing statements, the null hypothesis (H0) and the alternative hypothesis (Ha) and using data from a sample to test these hypotheses.</w:t>
+            </w:r>
+          </w:p>
+          <w:p>
+            <w:pPr>
+              <w:pStyle w:val="TableParagraph"/>
+              <w:rPr>
+                <w:rFonts w:asciiTheme="minorHAnsi" w:hAnsiTheme="minorHAnsi" w:cstheme="minorHAnsi"/>
+                <w:sz w:val="28"/>
+                <w:szCs w:val="28"/>
+              </w:rPr>
+            </w:pPr>
+          </w:p>
+          <w:p>
+            <w:pPr>
+              <w:pStyle w:val="TableParagraph"/>
+              <w:rPr>
+                <w:rFonts w:asciiTheme="minorHAnsi" w:hAnsiTheme="minorHAnsi" w:cstheme="minorHAnsi"/>
+                <w:sz w:val="28"/>
+                <w:szCs w:val="28"/>
+              </w:rPr>
+            </w:pPr>
+            <w:r>
+              <w:rPr>
+                <w:rFonts w:asciiTheme="minorHAnsi" w:hAnsiTheme="minorHAnsi" w:cstheme="minorHAnsi"/>
+                <w:sz w:val="28"/>
+                <w:szCs w:val="28"/>
+              </w:rPr>
+              <w:t>The null hypothesis, denoted by H0, is a tentative assumption about a population parameter. It is typically a statement of no effect or no difference and is often the hypothesis that a researcher aims to disprove.</w:t>
             </w:r>
           </w:p>
           <w:p>
@@ -882,18 +850,18 @@
           <w:tbl>
             <w:tblPr>
               <w:tblStyle w:val="TableGrid"/>
-              <w:tblW w:w="4843" w:type="pct"/>
+              <w:tblW w:w="0" w:type="auto"/>
               <w:tblLook w:val="04A0" w:firstRow="1" w:lastRow="0" w:firstColumn="1" w:lastColumn="0" w:noHBand="0" w:noVBand="1"/>
             </w:tblPr>
             <w:tblGrid>
-              <w:gridCol w:w="2118"/>
-              <w:gridCol w:w="3913"/>
-              <w:gridCol w:w="3981"/>
+              <w:gridCol w:w="2117"/>
+              <w:gridCol w:w="3394"/>
+              <w:gridCol w:w="3454"/>
             </w:tblGrid>
             <w:tr>
               <w:tc>
                 <w:tcPr>
-                  <w:tcW w:w="1057" w:type="pct"/>
+                  <w:tcW w:w="0" w:type="auto"/>
                   <w:shd w:val="clear" w:color="auto" w:fill="D9D9D9" w:themeFill="background1" w:themeFillShade="D9"/>
                   <w:noWrap/>
                   <w:hideMark/>
@@ -913,7 +881,7 @@
               </w:tc>
               <w:tc>
                 <w:tcPr>
-                  <w:tcW w:w="1954" w:type="pct"/>
+                  <w:tcW w:w="0" w:type="auto"/>
                   <w:shd w:val="clear" w:color="auto" w:fill="D9D9D9" w:themeFill="background1" w:themeFillShade="D9"/>
                   <w:noWrap/>
                   <w:hideMark/>
@@ -944,7 +912,7 @@
               </w:tc>
               <w:tc>
                 <w:tcPr>
-                  <w:tcW w:w="1988" w:type="pct"/>
+                  <w:tcW w:w="0" w:type="auto"/>
                   <w:shd w:val="clear" w:color="auto" w:fill="D9D9D9" w:themeFill="background1" w:themeFillShade="D9"/>
                   <w:noWrap/>
                   <w:hideMark/>
@@ -977,7 +945,7 @@
             <w:tr>
               <w:tc>
                 <w:tcPr>
-                  <w:tcW w:w="1057" w:type="pct"/>
+                  <w:tcW w:w="0" w:type="auto"/>
                   <w:shd w:val="clear" w:color="auto" w:fill="D9D9D9" w:themeFill="background1" w:themeFillShade="D9"/>
                   <w:hideMark/>
                 </w:tcPr>
@@ -1007,7 +975,7 @@
               </w:tc>
               <w:tc>
                 <w:tcPr>
-                  <w:tcW w:w="1954" w:type="pct"/>
+                  <w:tcW w:w="0" w:type="auto"/>
                   <w:hideMark/>
                 </w:tcPr>
                 <w:p>
@@ -1032,7 +1000,7 @@
               </w:tc>
               <w:tc>
                 <w:tcPr>
-                  <w:tcW w:w="1988" w:type="pct"/>
+                  <w:tcW w:w="0" w:type="auto"/>
                   <w:hideMark/>
                 </w:tcPr>
                 <w:p>
@@ -1059,7 +1027,7 @@
             <w:tr>
               <w:tc>
                 <w:tcPr>
-                  <w:tcW w:w="1057" w:type="pct"/>
+                  <w:tcW w:w="0" w:type="auto"/>
                   <w:shd w:val="clear" w:color="auto" w:fill="D9D9D9" w:themeFill="background1" w:themeFillShade="D9"/>
                   <w:hideMark/>
                 </w:tcPr>
@@ -1089,7 +1057,7 @@
               </w:tc>
               <w:tc>
                 <w:tcPr>
-                  <w:tcW w:w="1954" w:type="pct"/>
+                  <w:tcW w:w="0" w:type="auto"/>
                   <w:hideMark/>
                 </w:tcPr>
                 <w:p>
@@ -1114,7 +1082,7 @@
               </w:tc>
               <w:tc>
                 <w:tcPr>
-                  <w:tcW w:w="1988" w:type="pct"/>
+                  <w:tcW w:w="0" w:type="auto"/>
                   <w:hideMark/>
                 </w:tcPr>
                 <w:p>
@@ -1141,7 +1109,7 @@
             <w:tr>
               <w:tc>
                 <w:tcPr>
-                  <w:tcW w:w="1057" w:type="pct"/>
+                  <w:tcW w:w="0" w:type="auto"/>
                   <w:shd w:val="clear" w:color="auto" w:fill="D9D9D9" w:themeFill="background1" w:themeFillShade="D9"/>
                   <w:hideMark/>
                 </w:tcPr>
@@ -1171,7 +1139,7 @@
               </w:tc>
               <w:tc>
                 <w:tcPr>
-                  <w:tcW w:w="1954" w:type="pct"/>
+                  <w:tcW w:w="0" w:type="auto"/>
                   <w:hideMark/>
                 </w:tcPr>
                 <w:p>
@@ -1196,7 +1164,7 @@
               </w:tc>
               <w:tc>
                 <w:tcPr>
-                  <w:tcW w:w="1988" w:type="pct"/>
+                  <w:tcW w:w="0" w:type="auto"/>
                   <w:hideMark/>
                 </w:tcPr>
                 <w:p>
@@ -1242,18 +1210,18 @@
           <w:tbl>
             <w:tblPr>
               <w:tblStyle w:val="TableGrid"/>
-              <w:tblW w:w="5000" w:type="pct"/>
+              <w:tblW w:w="9766" w:type="dxa"/>
               <w:tblLook w:val="04A0" w:firstRow="1" w:lastRow="0" w:firstColumn="1" w:lastColumn="0" w:noHBand="0" w:noVBand="1"/>
             </w:tblPr>
             <w:tblGrid>
-              <w:gridCol w:w="1973"/>
-              <w:gridCol w:w="3688"/>
-              <w:gridCol w:w="4676"/>
+              <w:gridCol w:w="1768"/>
+              <w:gridCol w:w="3671"/>
+              <w:gridCol w:w="4327"/>
             </w:tblGrid>
             <w:tr>
               <w:tc>
                 <w:tcPr>
-                  <w:tcW w:w="954" w:type="pct"/>
+                  <w:tcW w:w="0" w:type="auto"/>
                   <w:shd w:val="clear" w:color="auto" w:fill="D9D9D9" w:themeFill="background1" w:themeFillShade="D9"/>
                   <w:noWrap/>
                   <w:hideMark/>
@@ -1273,7 +1241,7 @@
               </w:tc>
               <w:tc>
                 <w:tcPr>
-                  <w:tcW w:w="1784" w:type="pct"/>
+                  <w:tcW w:w="0" w:type="auto"/>
                   <w:shd w:val="clear" w:color="auto" w:fill="D9D9D9" w:themeFill="background1" w:themeFillShade="D9"/>
                   <w:noWrap/>
                   <w:hideMark/>
@@ -1304,7 +1272,7 @@
               </w:tc>
               <w:tc>
                 <w:tcPr>
-                  <w:tcW w:w="2262" w:type="pct"/>
+                  <w:tcW w:w="0" w:type="auto"/>
                   <w:shd w:val="clear" w:color="auto" w:fill="D9D9D9" w:themeFill="background1" w:themeFillShade="D9"/>
                   <w:noWrap/>
                   <w:hideMark/>
@@ -1337,7 +1305,7 @@
             <w:tr>
               <w:tc>
                 <w:tcPr>
-                  <w:tcW w:w="954" w:type="pct"/>
+                  <w:tcW w:w="0" w:type="auto"/>
                   <w:shd w:val="clear" w:color="auto" w:fill="D9D9D9" w:themeFill="background1" w:themeFillShade="D9"/>
                   <w:hideMark/>
                 </w:tcPr>
@@ -1367,7 +1335,7 @@
               </w:tc>
               <w:tc>
                 <w:tcPr>
-                  <w:tcW w:w="1784" w:type="pct"/>
+                  <w:tcW w:w="0" w:type="auto"/>
                   <w:hideMark/>
                 </w:tcPr>
                 <w:p>
@@ -1392,7 +1360,7 @@
               </w:tc>
               <w:tc>
                 <w:tcPr>
-                  <w:tcW w:w="2262" w:type="pct"/>
+                  <w:tcW w:w="0" w:type="auto"/>
                   <w:hideMark/>
                 </w:tcPr>
                 <w:p>
@@ -1419,7 +1387,7 @@
             <w:tr>
               <w:tc>
                 <w:tcPr>
-                  <w:tcW w:w="954" w:type="pct"/>
+                  <w:tcW w:w="0" w:type="auto"/>
                   <w:shd w:val="clear" w:color="auto" w:fill="D9D9D9" w:themeFill="background1" w:themeFillShade="D9"/>
                   <w:hideMark/>
                 </w:tcPr>
@@ -1449,7 +1417,7 @@
               </w:tc>
               <w:tc>
                 <w:tcPr>
-                  <w:tcW w:w="1784" w:type="pct"/>
+                  <w:tcW w:w="0" w:type="auto"/>
                   <w:hideMark/>
                 </w:tcPr>
                 <w:p>
@@ -1474,7 +1442,7 @@
               </w:tc>
               <w:tc>
                 <w:tcPr>
-                  <w:tcW w:w="2262" w:type="pct"/>
+                  <w:tcW w:w="0" w:type="auto"/>
                   <w:hideMark/>
                 </w:tcPr>
                 <w:p>
@@ -1501,7 +1469,7 @@
             <w:tr>
               <w:tc>
                 <w:tcPr>
-                  <w:tcW w:w="954" w:type="pct"/>
+                  <w:tcW w:w="0" w:type="auto"/>
                   <w:shd w:val="clear" w:color="auto" w:fill="D9D9D9" w:themeFill="background1" w:themeFillShade="D9"/>
                   <w:hideMark/>
                 </w:tcPr>
@@ -1531,7 +1499,7 @@
               </w:tc>
               <w:tc>
                 <w:tcPr>
-                  <w:tcW w:w="1784" w:type="pct"/>
+                  <w:tcW w:w="0" w:type="auto"/>
                   <w:hideMark/>
                 </w:tcPr>
                 <w:p>
@@ -1556,7 +1524,7 @@
               </w:tc>
               <w:tc>
                 <w:tcPr>
-                  <w:tcW w:w="2262" w:type="pct"/>
+                  <w:tcW w:w="0" w:type="auto"/>
                   <w:hideMark/>
                 </w:tcPr>
                 <w:p>
@@ -1583,7 +1551,7 @@
             <w:tr>
               <w:tc>
                 <w:tcPr>
-                  <w:tcW w:w="954" w:type="pct"/>
+                  <w:tcW w:w="0" w:type="auto"/>
                   <w:shd w:val="clear" w:color="auto" w:fill="D9D9D9" w:themeFill="background1" w:themeFillShade="D9"/>
                   <w:hideMark/>
                 </w:tcPr>
@@ -1613,7 +1581,7 @@
               </w:tc>
               <w:tc>
                 <w:tcPr>
-                  <w:tcW w:w="1784" w:type="pct"/>
+                  <w:tcW w:w="0" w:type="auto"/>
                   <w:hideMark/>
                 </w:tcPr>
                 <w:p>
@@ -1638,7 +1606,7 @@
               </w:tc>
               <w:tc>
                 <w:tcPr>
-                  <w:tcW w:w="2262" w:type="pct"/>
+                  <w:tcW w:w="0" w:type="auto"/>
                   <w:hideMark/>
                 </w:tcPr>
                 <w:p>
@@ -2423,8 +2391,8 @@
               <w:pStyle w:val="TableParagraph"/>
               <w:rPr>
                 <w:rFonts w:asciiTheme="minorHAnsi" w:hAnsiTheme="minorHAnsi" w:cstheme="minorHAnsi"/>
-                <w:sz w:val="28"/>
-                <w:szCs w:val="28"/>
+                <w:sz w:val="24"/>
+                <w:szCs w:val="24"/>
                 <w:lang w:val="en-IN"/>
               </w:rPr>
             </w:pPr>
@@ -2459,8 +2427,8 @@
               <w:ind w:left="720"/>
               <w:rPr>
                 <w:rFonts w:asciiTheme="minorHAnsi" w:hAnsiTheme="minorHAnsi" w:cstheme="minorHAnsi"/>
-                <w:sz w:val="28"/>
-                <w:szCs w:val="28"/>
+                <w:sz w:val="24"/>
+                <w:szCs w:val="24"/>
                 <w:lang w:val="en-IN"/>
               </w:rPr>
             </w:pPr>
@@ -2495,8 +2463,8 @@
               <w:ind w:left="720"/>
               <w:rPr>
                 <w:rFonts w:asciiTheme="minorHAnsi" w:hAnsiTheme="minorHAnsi" w:cstheme="minorHAnsi"/>
-                <w:sz w:val="28"/>
-                <w:szCs w:val="28"/>
+                <w:sz w:val="24"/>
+                <w:szCs w:val="24"/>
                 <w:lang w:val="en-IN"/>
               </w:rPr>
             </w:pPr>
@@ -2531,8 +2499,8 @@
               <w:ind w:left="0"/>
               <w:rPr>
                 <w:rFonts w:asciiTheme="minorHAnsi" w:hAnsiTheme="minorHAnsi" w:cstheme="minorHAnsi"/>
-                <w:sz w:val="28"/>
-                <w:szCs w:val="28"/>
+                <w:sz w:val="24"/>
+                <w:szCs w:val="24"/>
                 <w:lang w:val="en-IN"/>
               </w:rPr>
             </w:pPr>
@@ -2567,8 +2535,8 @@
               <w:ind w:left="0"/>
               <w:rPr>
                 <w:rFonts w:asciiTheme="minorHAnsi" w:hAnsiTheme="minorHAnsi" w:cstheme="minorHAnsi"/>
-                <w:sz w:val="28"/>
-                <w:szCs w:val="28"/>
+                <w:sz w:val="24"/>
+                <w:szCs w:val="24"/>
                 <w:lang w:val="en-IN"/>
               </w:rPr>
             </w:pPr>
@@ -2623,8 +2591,8 @@
               <w:ind w:left="0"/>
               <w:rPr>
                 <w:rFonts w:asciiTheme="minorHAnsi" w:hAnsiTheme="minorHAnsi" w:cstheme="minorHAnsi"/>
-                <w:sz w:val="28"/>
-                <w:szCs w:val="28"/>
+                <w:sz w:val="24"/>
+                <w:szCs w:val="24"/>
                 <w:lang w:val="en-IN"/>
               </w:rPr>
             </w:pPr>
@@ -2701,7 +2669,7 @@
           <w:szCs w:val="28"/>
         </w:rPr>
         <w:sectPr>
-          <w:pgSz w:w="11913" w:h="12191"/>
+          <w:pgSz w:w="11913" w:h="11340"/>
           <w:pgMar w:top="142" w:right="573" w:bottom="278" w:left="697" w:header="720" w:footer="720" w:gutter="0"/>
           <w:cols w:space="720"/>
         </w:sectPr>
@@ -3100,17 +3068,15 @@
               </w:rPr>
               <w:t xml:space="preserve">: If the test statistic falls in the rejection region, reject the null hypothesis in </w:t>
             </w:r>
-            <w:proofErr w:type="spellStart"/>
-            <w:r>
-              <w:rPr>
-                <w:rFonts w:asciiTheme="minorHAnsi" w:hAnsiTheme="minorHAnsi" w:cstheme="minorHAnsi"/>
-                <w:sz w:val="28"/>
-                <w:szCs w:val="28"/>
-                <w:lang w:val="en-IN"/>
-              </w:rPr>
-              <w:t>favor</w:t>
-            </w:r>
-            <w:proofErr w:type="spellEnd"/>
+            <w:r>
+              <w:rPr>
+                <w:rFonts w:asciiTheme="minorHAnsi" w:hAnsiTheme="minorHAnsi" w:cstheme="minorHAnsi"/>
+                <w:sz w:val="28"/>
+                <w:szCs w:val="28"/>
+                <w:lang w:val="en-IN"/>
+              </w:rPr>
+              <w:t>favour</w:t>
+            </w:r>
             <w:r>
               <w:rPr>
                 <w:rFonts w:asciiTheme="minorHAnsi" w:hAnsiTheme="minorHAnsi" w:cstheme="minorHAnsi"/>
@@ -3432,7 +3398,7 @@
           <w:szCs w:val="28"/>
         </w:rPr>
         <w:sectPr>
-          <w:pgSz w:w="11913" w:h="11340"/>
+          <w:pgSz w:w="11913" w:h="5670"/>
           <w:pgMar w:top="142" w:right="573" w:bottom="278" w:left="697" w:header="720" w:footer="720" w:gutter="0"/>
           <w:cols w:space="720"/>
         </w:sectPr>
@@ -3592,8 +3558,8 @@
               <w:spacing w:before="71"/>
               <w:rPr>
                 <w:rFonts w:asciiTheme="minorHAnsi" w:hAnsiTheme="minorHAnsi" w:cstheme="minorHAnsi"/>
-                <w:sz w:val="28"/>
-                <w:szCs w:val="28"/>
+                <w:sz w:val="24"/>
+                <w:szCs w:val="24"/>
               </w:rPr>
             </w:pPr>
           </w:p>
@@ -3622,8 +3588,8 @@
               <w:spacing w:before="71"/>
               <w:rPr>
                 <w:rFonts w:asciiTheme="minorHAnsi" w:hAnsiTheme="minorHAnsi" w:cstheme="minorHAnsi"/>
-                <w:sz w:val="28"/>
-                <w:szCs w:val="28"/>
+                <w:sz w:val="24"/>
+                <w:szCs w:val="24"/>
               </w:rPr>
             </w:pPr>
           </w:p>
@@ -3723,8 +3689,8 @@
                 <w:rFonts w:asciiTheme="minorHAnsi" w:hAnsiTheme="minorHAnsi" w:cstheme="minorHAnsi"/>
                 <w:b/>
                 <w:bCs/>
-                <w:sz w:val="28"/>
-                <w:szCs w:val="28"/>
+                <w:sz w:val="24"/>
+                <w:szCs w:val="24"/>
               </w:rPr>
             </w:pPr>
           </w:p>
@@ -3800,8 +3766,8 @@
                 <w:rFonts w:asciiTheme="minorHAnsi" w:hAnsiTheme="minorHAnsi" w:cstheme="minorHAnsi"/>
                 <w:b/>
                 <w:bCs/>
-                <w:sz w:val="28"/>
-                <w:szCs w:val="28"/>
+                <w:sz w:val="24"/>
+                <w:szCs w:val="24"/>
               </w:rPr>
             </w:pPr>
           </w:p>
@@ -3840,7 +3806,7 @@
           <w:szCs w:val="28"/>
         </w:rPr>
         <w:sectPr>
-          <w:pgSz w:w="11913" w:h="10773"/>
+          <w:pgSz w:w="11913" w:h="8505"/>
           <w:pgMar w:top="142" w:right="573" w:bottom="278" w:left="697" w:header="720" w:footer="720" w:gutter="0"/>
           <w:cols w:space="720"/>
         </w:sectPr>
@@ -4232,34 +4198,14 @@
           <w:tab w:val="left" w:pos="1841"/>
           <w:tab w:val="center" w:pos="5322"/>
         </w:tabs>
-        <w:ind w:left="1"/>
+        <w:ind w:left="0"/>
         <w:rPr>
           <w:rFonts w:asciiTheme="minorHAnsi" w:hAnsiTheme="minorHAnsi" w:cstheme="minorHAnsi"/>
           <w:sz w:val="28"/>
           <w:szCs w:val="28"/>
         </w:rPr>
-      </w:pPr>
-      <w:r>
-        <w:rPr>
-          <w:rFonts w:asciiTheme="minorHAnsi" w:hAnsiTheme="minorHAnsi" w:cstheme="minorHAnsi"/>
-          <w:sz w:val="28"/>
-          <w:szCs w:val="28"/>
-        </w:rPr>
-        <w:tab/>
-      </w:r>
-      <w:r>
-        <w:rPr>
-          <w:rFonts w:asciiTheme="minorHAnsi" w:hAnsiTheme="minorHAnsi" w:cstheme="minorHAnsi"/>
-          <w:sz w:val="28"/>
-          <w:szCs w:val="28"/>
-        </w:rPr>
-        <w:tab/>
-      </w:r>
-    </w:p>
-    <w:p>
-      <w:pPr>
         <w:sectPr>
-          <w:pgSz w:w="11913" w:h="10206"/>
+          <w:pgSz w:w="11913" w:h="9752"/>
           <w:pgMar w:top="142" w:right="573" w:bottom="278" w:left="697" w:header="720" w:footer="720" w:gutter="0"/>
           <w:cols w:space="720"/>
         </w:sectPr>
@@ -4733,7 +4679,7 @@
           <w:szCs w:val="28"/>
         </w:rPr>
         <w:sectPr>
-          <w:pgSz w:w="11913" w:h="13041"/>
+          <w:pgSz w:w="11913" w:h="10206"/>
           <w:pgMar w:top="142" w:right="573" w:bottom="278" w:left="697" w:header="720" w:footer="720" w:gutter="0"/>
           <w:cols w:space="720"/>
         </w:sectPr>
@@ -5753,18 +5699,13 @@
       <w:pPr>
         <w:rPr>
           <w:rFonts w:asciiTheme="minorHAnsi" w:hAnsiTheme="minorHAnsi" w:cstheme="minorHAnsi"/>
-        </w:rPr>
-      </w:pPr>
-    </w:p>
-    <w:p>
-      <w:pPr>
-        <w:rPr>
-          <w:rFonts w:asciiTheme="minorHAnsi" w:hAnsiTheme="minorHAnsi" w:cstheme="minorHAnsi"/>
+          <w:sz w:val="28"/>
+          <w:szCs w:val="28"/>
         </w:rPr>
       </w:pPr>
     </w:p>
     <w:sectPr>
-      <w:pgSz w:w="11913" w:h="13041"/>
+      <w:pgSz w:w="11913" w:h="12758"/>
       <w:pgMar w:top="0" w:right="1480" w:bottom="0" w:left="697" w:header="720" w:footer="720" w:gutter="0"/>
       <w:cols w:space="720"/>
     </w:sectPr>
@@ -7594,6 +7535,7 @@
   <w:style w:type="character" w:default="1" w:styleId="DefaultParagraphFont">
     <w:name w:val="Default Paragraph Font"/>
     <w:uiPriority w:val="1"/>
+    <w:semiHidden/>
     <w:unhideWhenUsed/>
   </w:style>
   <w:style w:type="table" w:default="1" w:styleId="TableNormal">

</xml_diff>